<commit_message>
improve part one diagrams and card images
Co-authored-by: Copilot <223556219+Copilot@users.noreply.github.com>
</commit_message>
<xml_diff>
--- a/part one/part1.docx
+++ b/part one/part1.docx
@@ -20,19 +20,88 @@
         <w:pStyle w:val="Heading1"/>
       </w:pPr>
       <w:r>
-        <w:t>Pokemon brief explanation</w:t>
+        <w:t>Pokemon TCG brief explanation</w:t>
       </w:r>
     </w:p>
     <w:p>
       <w:r>
-        <w:t>Pokemon Trading Card Game is a competitive strategy card game where players use 60-card decks to battle by attacking opposing Pokemon and collecting Prize cards. The administration system in this project manages core platform data used by staff: players, cards, deck lists, tournaments, and tournament registrations.</w:t>
+        <w:t>Pokemon Trading Card Game is a strategy game using 60-card decks. Players battle with Pokemon, use Energy to pay attack costs, and use Trainer cards for tactical effects. The system in this task supports staff who manage platform data and tournament operations.</w:t>
+      </w:r>
+    </w:p>
+    <w:p>
+      <w:pPr>
+        <w:pStyle w:val="Heading1"/>
+      </w:pPr>
+      <w:r>
+        <w:t>Pokemon card types and purposes</w:t>
+      </w:r>
+    </w:p>
+    <w:p>
+      <w:pPr>
+        <w:pStyle w:val="ListBullet"/>
+      </w:pPr>
+      <w:r>
+        <w:t>Pokemon cards: core battle cards (Basic, Stage 1, Stage 2).</w:t>
+      </w:r>
+    </w:p>
+    <w:p>
+      <w:pPr>
+        <w:pStyle w:val="ListBullet"/>
+      </w:pPr>
+      <w:r>
+        <w:t>Energy cards: power attacks and abilities (Basic/Special).</w:t>
+      </w:r>
+    </w:p>
+    <w:p>
+      <w:pPr>
+        <w:pStyle w:val="ListBullet"/>
+      </w:pPr>
+      <w:r>
+        <w:t>Trainer Item: quick tactical effects.</w:t>
+      </w:r>
+    </w:p>
+    <w:p>
+      <w:pPr>
+        <w:pStyle w:val="ListBullet"/>
+      </w:pPr>
+      <w:r>
+        <w:t>Trainer Supporter: stronger effects, one per turn.</w:t>
+      </w:r>
+    </w:p>
+    <w:p>
+      <w:pPr>
+        <w:pStyle w:val="ListBullet"/>
+      </w:pPr>
+      <w:r>
+        <w:t>Trainer Stadium: persistent field effect until replaced.</w:t>
+      </w:r>
+    </w:p>
+    <w:p>
+      <w:pPr>
+        <w:pStyle w:val="ListBullet"/>
+      </w:pPr>
+      <w:r>
+        <w:t>Trainer Pokemon Tool: attached bonus effect on a Pokemon.</w:t>
+      </w:r>
+    </w:p>
+    <w:p>
+      <w:r>
+        <w:t>Example card images:</w:t>
+      </w:r>
+    </w:p>
+    <w:p>
+      <w:pPr>
+        <w:pStyle w:val="ListBullet"/>
+      </w:pPr>
+      <w:r>
+        <w:t>Pokemon card sample</w:t>
       </w:r>
     </w:p>
     <w:p>
       <w:r>
         <w:drawing>
           <wp:inline xmlns:a="http://schemas.openxmlformats.org/drawingml/2006/main" xmlns:pic="http://schemas.openxmlformats.org/drawingml/2006/picture">
-            <wp:extent cx="6126480" cy="2083003"/>
+            <wp:extent cx="1828800" cy="2514600"/>
             <wp:docPr id="1" name="Picture 1"/>
             <wp:cNvGraphicFramePr>
               <a:graphicFrameLocks noChangeAspect="1"/>
@@ -41,7 +110,7 @@
               <a:graphicData uri="http://schemas.openxmlformats.org/drawingml/2006/picture">
                 <pic:pic>
                   <pic:nvPicPr>
-                    <pic:cNvPr id="0" name="pokemon_tcg_overview.png"/>
+                    <pic:cNvPr id="0" name="pokemon_card.png"/>
                     <pic:cNvPicPr/>
                   </pic:nvPicPr>
                   <pic:blipFill>
@@ -53,7 +122,7 @@
                   <pic:spPr>
                     <a:xfrm>
                       <a:off x="0" y="0"/>
-                      <a:ext cx="6126480" cy="2083003"/>
+                      <a:ext cx="1828800" cy="2514600"/>
                     </a:xfrm>
                     <a:prstGeom prst="rect"/>
                   </pic:spPr>
@@ -66,70 +135,17 @@
     </w:p>
     <w:p>
       <w:pPr>
-        <w:pStyle w:val="Heading1"/>
-      </w:pPr>
-      <w:r>
-        <w:t>Pokemon card types and purposes</w:t>
-      </w:r>
-    </w:p>
-    <w:p>
-      <w:r>
-        <w:t>This project models all core card categories used in deck construction and tournament operations:</w:t>
-      </w:r>
-    </w:p>
-    <w:p>
-      <w:pPr>
         <w:pStyle w:val="ListBullet"/>
       </w:pPr>
       <w:r>
-        <w:t>Pokemon cards: active/bench battlers; include Basic, Stage 1, and Stage 2 progression.</w:t>
-      </w:r>
-    </w:p>
-    <w:p>
-      <w:pPr>
-        <w:pStyle w:val="ListBullet"/>
-      </w:pPr>
-      <w:r>
-        <w:t>Energy cards: basic or special energy used to power attacks and abilities.</w:t>
-      </w:r>
-    </w:p>
-    <w:p>
-      <w:pPr>
-        <w:pStyle w:val="ListBullet"/>
-      </w:pPr>
-      <w:r>
-        <w:t>Trainer Item cards: quick tactical effects with no one-per-turn limit.</w:t>
-      </w:r>
-    </w:p>
-    <w:p>
-      <w:pPr>
-        <w:pStyle w:val="ListBullet"/>
-      </w:pPr>
-      <w:r>
-        <w:t>Trainer Supporter cards: stronger effects, restricted to one per turn.</w:t>
-      </w:r>
-    </w:p>
-    <w:p>
-      <w:pPr>
-        <w:pStyle w:val="ListBullet"/>
-      </w:pPr>
-      <w:r>
-        <w:t>Trainer Stadium cards: persistent board-wide effects until replaced.</w:t>
-      </w:r>
-    </w:p>
-    <w:p>
-      <w:pPr>
-        <w:pStyle w:val="ListBullet"/>
-      </w:pPr>
-      <w:r>
-        <w:t>Trainer Pokemon Tool cards: attached equipment that modifies a Pokemon.</w:t>
+        <w:t>Energy card sample</w:t>
       </w:r>
     </w:p>
     <w:p>
       <w:r>
         <w:drawing>
           <wp:inline xmlns:a="http://schemas.openxmlformats.org/drawingml/2006/main" xmlns:pic="http://schemas.openxmlformats.org/drawingml/2006/picture">
-            <wp:extent cx="6126480" cy="3185770"/>
+            <wp:extent cx="1828800" cy="2514600"/>
             <wp:docPr id="2" name="Picture 2"/>
             <wp:cNvGraphicFramePr>
               <a:graphicFrameLocks noChangeAspect="1"/>
@@ -138,7 +154,7 @@
               <a:graphicData uri="http://schemas.openxmlformats.org/drawingml/2006/picture">
                 <pic:pic>
                   <pic:nvPicPr>
-                    <pic:cNvPr id="0" name="pokemon_card_types.png"/>
+                    <pic:cNvPr id="0" name="energy_card.png"/>
                     <pic:cNvPicPr/>
                   </pic:nvPicPr>
                   <pic:blipFill>
@@ -150,7 +166,51 @@
                   <pic:spPr>
                     <a:xfrm>
                       <a:off x="0" y="0"/>
-                      <a:ext cx="6126480" cy="3185770"/>
+                      <a:ext cx="1828800" cy="2514600"/>
+                    </a:xfrm>
+                    <a:prstGeom prst="rect"/>
+                  </pic:spPr>
+                </pic:pic>
+              </a:graphicData>
+            </a:graphic>
+          </wp:inline>
+        </w:drawing>
+      </w:r>
+    </w:p>
+    <w:p>
+      <w:pPr>
+        <w:pStyle w:val="ListBullet"/>
+      </w:pPr>
+      <w:r>
+        <w:t>Trainer card sample</w:t>
+      </w:r>
+    </w:p>
+    <w:p>
+      <w:r>
+        <w:drawing>
+          <wp:inline xmlns:a="http://schemas.openxmlformats.org/drawingml/2006/main" xmlns:pic="http://schemas.openxmlformats.org/drawingml/2006/picture">
+            <wp:extent cx="1828800" cy="2514600"/>
+            <wp:docPr id="3" name="Picture 3"/>
+            <wp:cNvGraphicFramePr>
+              <a:graphicFrameLocks noChangeAspect="1"/>
+            </wp:cNvGraphicFramePr>
+            <a:graphic>
+              <a:graphicData uri="http://schemas.openxmlformats.org/drawingml/2006/picture">
+                <pic:pic>
+                  <pic:nvPicPr>
+                    <pic:cNvPr id="0" name="trainer_card.png"/>
+                    <pic:cNvPicPr/>
+                  </pic:nvPicPr>
+                  <pic:blipFill>
+                    <a:blip r:embed="rId11"/>
+                    <a:stretch>
+                      <a:fillRect/>
+                    </a:stretch>
+                  </pic:blipFill>
+                  <pic:spPr>
+                    <a:xfrm>
+                      <a:off x="0" y="0"/>
+                      <a:ext cx="1828800" cy="2514600"/>
                     </a:xfrm>
                     <a:prstGeom prst="rect"/>
                   </pic:spPr>
@@ -174,39 +234,43 @@
         <w:pStyle w:val="Heading2"/>
       </w:pPr>
       <w:r>
-        <w:t>1.1 Project schedule</w:t>
+        <w:t>1.1 Project schedule (Gantt chart)</w:t>
       </w:r>
     </w:p>
     <w:p>
-      <w:pPr>
-        <w:pStyle w:val="ListBullet"/>
-      </w:pPr>
       <w:r>
-        <w:t>Day 1: brief and scope lock.</w:t>
-      </w:r>
-    </w:p>
-    <w:p>
-      <w:pPr>
-        <w:pStyle w:val="ListBullet"/>
-      </w:pPr>
-      <w:r>
-        <w:t>Day 2: problem outline and detailed description.</w:t>
-      </w:r>
-    </w:p>
-    <w:p>
-      <w:pPr>
-        <w:pStyle w:val="ListBullet"/>
-      </w:pPr>
-      <w:r>
-        <w:t>Day 3: ethical, legal, security, data integrity analysis.</w:t>
-      </w:r>
-    </w:p>
-    <w:p>
-      <w:pPr>
-        <w:pStyle w:val="ListBullet"/>
-      </w:pPr>
-      <w:r>
-        <w:t>Day 4: ERD, relational notation, data dictionary, SQL query list, structure chart and function specifications.</w:t>
+        <w:drawing>
+          <wp:inline xmlns:a="http://schemas.openxmlformats.org/drawingml/2006/main" xmlns:pic="http://schemas.openxmlformats.org/drawingml/2006/picture">
+            <wp:extent cx="6217920" cy="2362810"/>
+            <wp:docPr id="4" name="Picture 4"/>
+            <wp:cNvGraphicFramePr>
+              <a:graphicFrameLocks noChangeAspect="1"/>
+            </wp:cNvGraphicFramePr>
+            <a:graphic>
+              <a:graphicData uri="http://schemas.openxmlformats.org/drawingml/2006/picture">
+                <pic:pic>
+                  <pic:nvPicPr>
+                    <pic:cNvPr id="0" name="gantt.png"/>
+                    <pic:cNvPicPr/>
+                  </pic:nvPicPr>
+                  <pic:blipFill>
+                    <a:blip r:embed="rId12"/>
+                    <a:stretch>
+                      <a:fillRect/>
+                    </a:stretch>
+                  </pic:blipFill>
+                  <pic:spPr>
+                    <a:xfrm>
+                      <a:off x="0" y="0"/>
+                      <a:ext cx="6217920" cy="2362810"/>
+                    </a:xfrm>
+                    <a:prstGeom prst="rect"/>
+                  </pic:spPr>
+                </pic:pic>
+              </a:graphicData>
+            </a:graphic>
+          </wp:inline>
+        </w:drawing>
       </w:r>
     </w:p>
     <w:p>
@@ -219,7 +283,7 @@
     </w:p>
     <w:p>
       <w:r>
-        <w:t>Purpose: internal admin interface for authorised staff to manage platform records without writing SQL.</w:t>
+        <w:t>Purpose: provide an admin interface so staff can manage players, cards, decks, tournaments and reports without manual SQL.</w:t>
       </w:r>
     </w:p>
     <w:p>
@@ -229,7 +293,7 @@
     </w:p>
     <w:p>
       <w:r>
-        <w:t>Objectives: accurate records, efficient CRUD workflows, strong validation and reporting support.</w:t>
+        <w:t>Objectives: accurate records, efficient CRUD workflows, strong validation, and report generation.</w:t>
       </w:r>
     </w:p>
     <w:p>
@@ -242,7 +306,7 @@
     </w:p>
     <w:p>
       <w:r>
-        <w:t>Staff use a Python menu interface backed by SQLite to create, search, update and delete players, card data, decks and tournaments. The system enforces data quality using constraints and validation while supporting report generation for operational decisions.</w:t>
+        <w:t>A Python menu system uses SQLite to create, search, update, and delete operational records. Constraints and validation protect data quality. SQL reports produce activity summaries for staff decision making.</w:t>
       </w:r>
     </w:p>
     <w:p>
@@ -258,7 +322,7 @@
         <w:pStyle w:val="ListNumber"/>
       </w:pPr>
       <w:r>
-        <w:t>Manage player accounts (add/search/update/delete).</w:t>
+        <w:t>Manage player records.</w:t>
       </w:r>
     </w:p>
     <w:p>
@@ -274,7 +338,7 @@
         <w:pStyle w:val="ListNumber"/>
       </w:pPr>
       <w:r>
-        <w:t>Create and maintain decks and deck-card quantities.</w:t>
+        <w:t>Create and manage decks and deck card quantities.</w:t>
       </w:r>
     </w:p>
     <w:p>
@@ -282,7 +346,7 @@
         <w:pStyle w:val="ListNumber"/>
       </w:pPr>
       <w:r>
-        <w:t>Create tournaments and maintain tournament registrations.</w:t>
+        <w:t>Create tournaments and maintain player registrations.</w:t>
       </w:r>
     </w:p>
     <w:p>
@@ -290,7 +354,7 @@
         <w:pStyle w:val="ListNumber"/>
       </w:pPr>
       <w:r>
-        <w:t>Generate administrative statistics and reporting output.</w:t>
+        <w:t>Produce administrative reports and statistics.</w:t>
       </w:r>
     </w:p>
     <w:p>
@@ -298,7 +362,7 @@
         <w:pStyle w:val="ListNumber"/>
       </w:pPr>
       <w:r>
-        <w:t>Keep change-friendly and traceable records.</w:t>
+        <w:t>Support clear record management workflows.</w:t>
       </w:r>
     </w:p>
     <w:p>
@@ -314,7 +378,7 @@
         <w:pStyle w:val="ListBullet"/>
       </w:pPr>
       <w:r>
-        <w:t>Usability: clear menu prompts and consistent navigation.</w:t>
+        <w:t>Usability through clear menu prompts.</w:t>
       </w:r>
     </w:p>
     <w:p>
@@ -322,7 +386,7 @@
         <w:pStyle w:val="ListBullet"/>
       </w:pPr>
       <w:r>
-        <w:t>Performance: quick filtered searches on class-scale data volumes.</w:t>
+        <w:t>Performance on school-scale data sizes.</w:t>
       </w:r>
     </w:p>
     <w:p>
@@ -330,7 +394,7 @@
         <w:pStyle w:val="ListBullet"/>
       </w:pPr>
       <w:r>
-        <w:t>Reliability: transaction-safe updates to related data.</w:t>
+        <w:t>Reliability using transaction-safe updates.</w:t>
       </w:r>
     </w:p>
     <w:p>
@@ -338,7 +402,7 @@
         <w:pStyle w:val="ListBullet"/>
       </w:pPr>
       <w:r>
-        <w:t>Security: parameterised SQL and access restriction assumptions.</w:t>
+        <w:t>Security through parameterised SQL and controlled access assumptions.</w:t>
       </w:r>
     </w:p>
     <w:p>
@@ -346,7 +410,7 @@
         <w:pStyle w:val="ListBullet"/>
       </w:pPr>
       <w:r>
-        <w:t>Maintainability: modular function design and shared DB helpers.</w:t>
+        <w:t>Maintainability using modular function design.</w:t>
       </w:r>
     </w:p>
     <w:p>
@@ -354,7 +418,7 @@
         <w:pStyle w:val="ListBullet"/>
       </w:pPr>
       <w:r>
-        <w:t>Integrity: PK/FK/NOT NULL/UNIQUE/CHECK constraints.</w:t>
+        <w:t>Integrity via PK/FK/NOT NULL/UNIQUE/CHECK constraints.</w:t>
       </w:r>
     </w:p>
     <w:p>
@@ -370,7 +434,7 @@
         <w:pStyle w:val="ListBullet"/>
       </w:pPr>
       <w:r>
-        <w:t>Protect player data using minimal collection and controlled access.</w:t>
+        <w:t>Protect player data and restrict access to authorised staff.</w:t>
       </w:r>
     </w:p>
     <w:p>
@@ -378,7 +442,7 @@
         <w:pStyle w:val="ListBullet"/>
       </w:pPr>
       <w:r>
-        <w:t>Respect card-data intellectual property by using public reference metadata for educational scope.</w:t>
+        <w:t>Use card metadata responsibly within educational scope.</w:t>
       </w:r>
     </w:p>
     <w:p>
@@ -386,7 +450,7 @@
         <w:pStyle w:val="ListBullet"/>
       </w:pPr>
       <w:r>
-        <w:t>Use parameterised SQL to reduce injection risk.</w:t>
+        <w:t>Reduce injection risks by parameterising queries.</w:t>
       </w:r>
     </w:p>
     <w:p>
@@ -394,7 +458,7 @@
         <w:pStyle w:val="ListBullet"/>
       </w:pPr>
       <w:r>
-        <w:t>Maintain periodic backups during development and testing.</w:t>
+        <w:t>Maintain backups during development and testing.</w:t>
       </w:r>
     </w:p>
     <w:p>
@@ -402,7 +466,7 @@
         <w:pStyle w:val="Heading2"/>
       </w:pPr>
       <w:r>
-        <w:t>1.7 Data quality and integrity</w:t>
+        <w:t>1.7 Data quality and integrity factors</w:t>
       </w:r>
     </w:p>
     <w:p>
@@ -410,7 +474,7 @@
         <w:pStyle w:val="ListBullet"/>
       </w:pPr>
       <w:r>
-        <w:t>Duplicate prevention with UNIQUE constraints (e.g., email, set code).</w:t>
+        <w:t>Prevent duplicates using UNIQUE fields.</w:t>
       </w:r>
     </w:p>
     <w:p>
@@ -418,7 +482,7 @@
         <w:pStyle w:val="ListBullet"/>
       </w:pPr>
       <w:r>
-        <w:t>Completeness with NOT NULL on required fields.</w:t>
+        <w:t>Require essential data using NOT NULL constraints.</w:t>
       </w:r>
     </w:p>
     <w:p>
@@ -426,7 +490,7 @@
         <w:pStyle w:val="ListBullet"/>
       </w:pPr>
       <w:r>
-        <w:t>Validity with CHECK constraints (rarity, positive quantity).</w:t>
+        <w:t>Constrain value ranges with CHECK rules.</w:t>
       </w:r>
     </w:p>
     <w:p>
@@ -434,7 +498,7 @@
         <w:pStyle w:val="ListBullet"/>
       </w:pPr>
       <w:r>
-        <w:t>Referential integrity with foreign keys to stop orphan records.</w:t>
+        <w:t>Enforce referential integrity with foreign keys.</w:t>
       </w:r>
     </w:p>
     <w:p>
@@ -442,7 +506,7 @@
         <w:pStyle w:val="ListBullet"/>
       </w:pPr>
       <w:r>
-        <w:t>Consistency with transactions for multi-step writes.</w:t>
+        <w:t>Use transactions for multi-step consistency.</w:t>
       </w:r>
     </w:p>
     <w:p>
@@ -458,15 +522,15 @@
         <w:pStyle w:val="Heading2"/>
       </w:pPr>
       <w:r>
-        <w:t>2.1 ERD</w:t>
+        <w:t>2.1 ERD with cardinality labels</w:t>
       </w:r>
     </w:p>
     <w:p>
       <w:r>
         <w:drawing>
           <wp:inline xmlns:a="http://schemas.openxmlformats.org/drawingml/2006/main" xmlns:pic="http://schemas.openxmlformats.org/drawingml/2006/picture">
-            <wp:extent cx="6217920" cy="3676683"/>
-            <wp:docPr id="3" name="Picture 3"/>
+            <wp:extent cx="6309360" cy="3943350"/>
+            <wp:docPr id="5" name="Picture 5"/>
             <wp:cNvGraphicFramePr>
               <a:graphicFrameLocks noChangeAspect="1"/>
             </wp:cNvGraphicFramePr>
@@ -478,7 +542,7 @@
                     <pic:cNvPicPr/>
                   </pic:nvPicPr>
                   <pic:blipFill>
-                    <a:blip r:embed="rId11"/>
+                    <a:blip r:embed="rId13"/>
                     <a:stretch>
                       <a:fillRect/>
                     </a:stretch>
@@ -486,7 +550,7 @@
                   <pic:spPr>
                     <a:xfrm>
                       <a:off x="0" y="0"/>
-                      <a:ext cx="6217920" cy="3676683"/>
+                      <a:ext cx="6309360" cy="3943350"/>
                     </a:xfrm>
                     <a:prstGeom prst="rect"/>
                   </pic:spPr>
@@ -526,7 +590,7 @@
         <w:pStyle w:val="ListBullet"/>
       </w:pPr>
       <w:r>
-        <w:t>cards(card_id PK, set_id FK, name, rarity, card_type, mana_cost)</w:t>
+        <w:t>cards(card_id PK, set_id FK -&gt; card_sets.set_id, name, rarity, card_type, mana_cost)</w:t>
       </w:r>
     </w:p>
     <w:p>
@@ -534,7 +598,7 @@
         <w:pStyle w:val="ListBullet"/>
       </w:pPr>
       <w:r>
-        <w:t>decks(deck_id PK, player_id FK, name, created_date)</w:t>
+        <w:t>decks(deck_id PK, player_id FK -&gt; players.player_id, name, created_date)</w:t>
       </w:r>
     </w:p>
     <w:p>
@@ -542,7 +606,7 @@
         <w:pStyle w:val="ListBullet"/>
       </w:pPr>
       <w:r>
-        <w:t>deck_cards(deck_card_id PK, deck_id FK, card_id FK, quantity CHECK &gt; 0)</w:t>
+        <w:t>deck_cards(deck_card_id PK, deck_id FK -&gt; decks.deck_id, card_id FK -&gt; cards.card_id, quantity CHECK &gt; 0)</w:t>
       </w:r>
     </w:p>
     <w:p>
@@ -558,7 +622,7 @@
         <w:pStyle w:val="ListBullet"/>
       </w:pPr>
       <w:r>
-        <w:t>tournament_entries(entry_id PK, tournament_id FK, player_id FK, registration_date)</w:t>
+        <w:t>tournament_entries(entry_id PK, tournament_id FK -&gt; tournaments.tournament_id, player_id FK -&gt; players.player_id, registration_date)</w:t>
       </w:r>
     </w:p>
     <w:p>
@@ -612,7 +676,7 @@
           </w:tcPr>
           <w:p>
             <w:r>
-              <w:t>Constraints and purpose</w:t>
+              <w:t>Constraint/purpose</w:t>
             </w:r>
           </w:p>
         </w:tc>
@@ -740,7 +804,7 @@
           </w:tcPr>
           <w:p>
             <w:r>
-              <w:t>ISO date</w:t>
+              <w:t>ISO 8601 text</w:t>
             </w:r>
           </w:p>
         </w:tc>
@@ -790,7 +854,7 @@
           </w:tcPr>
           <w:p>
             <w:r>
-              <w:t>Constraints and purpose</w:t>
+              <w:t>Constraint/purpose</w:t>
             </w:r>
           </w:p>
         </w:tc>
@@ -918,7 +982,7 @@
           </w:tcPr>
           <w:p>
             <w:r>
-              <w:t>ISO date</w:t>
+              <w:t>ISO 8601 text</w:t>
             </w:r>
           </w:p>
         </w:tc>
@@ -968,7 +1032,7 @@
           </w:tcPr>
           <w:p>
             <w:r>
-              <w:t>Constraints and purpose</w:t>
+              <w:t>Constraint/purpose</w:t>
             </w:r>
           </w:p>
         </w:tc>
@@ -1128,7 +1192,7 @@
           </w:tcPr>
           <w:p>
             <w:r>
-              <w:t>nullable</w:t>
+              <w:t>optional</w:t>
             </w:r>
           </w:p>
         </w:tc>
@@ -1160,7 +1224,7 @@
           </w:tcPr>
           <w:p>
             <w:r>
-              <w:t>nullable</w:t>
+              <w:t>optional</w:t>
             </w:r>
           </w:p>
         </w:tc>
@@ -1210,7 +1274,7 @@
           </w:tcPr>
           <w:p>
             <w:r>
-              <w:t>Constraints and purpose</w:t>
+              <w:t>Constraint/purpose</w:t>
             </w:r>
           </w:p>
         </w:tc>
@@ -1338,7 +1402,7 @@
           </w:tcPr>
           <w:p>
             <w:r>
-              <w:t>ISO date</w:t>
+              <w:t>ISO 8601 text</w:t>
             </w:r>
           </w:p>
         </w:tc>
@@ -1388,7 +1452,7 @@
           </w:tcPr>
           <w:p>
             <w:r>
-              <w:t>Constraints and purpose</w:t>
+              <w:t>Constraint/purpose</w:t>
             </w:r>
           </w:p>
         </w:tc>
@@ -1516,7 +1580,7 @@
           </w:tcPr>
           <w:p>
             <w:r>
-              <w:t>CHECK &gt; 0</w:t>
+              <w:t>CHECK quantity &gt; 0</w:t>
             </w:r>
           </w:p>
         </w:tc>
@@ -1566,7 +1630,7 @@
           </w:tcPr>
           <w:p>
             <w:r>
-              <w:t>Constraints and purpose</w:t>
+              <w:t>Constraint/purpose</w:t>
             </w:r>
           </w:p>
         </w:tc>
@@ -1662,7 +1726,7 @@
           </w:tcPr>
           <w:p>
             <w:r>
-              <w:t>ISO date</w:t>
+              <w:t>ISO 8601 text</w:t>
             </w:r>
           </w:p>
         </w:tc>
@@ -1694,7 +1758,7 @@
           </w:tcPr>
           <w:p>
             <w:r>
-              <w:t>nullable</w:t>
+              <w:t>optional</w:t>
             </w:r>
           </w:p>
         </w:tc>
@@ -1744,7 +1808,7 @@
           </w:tcPr>
           <w:p>
             <w:r>
-              <w:t>Constraints and purpose</w:t>
+              <w:t>Constraint/purpose</w:t>
             </w:r>
           </w:p>
         </w:tc>
@@ -1872,7 +1936,7 @@
           </w:tcPr>
           <w:p>
             <w:r>
-              <w:t>ISO date</w:t>
+              <w:t>ISO 8601 text</w:t>
             </w:r>
           </w:p>
         </w:tc>
@@ -1884,7 +1948,7 @@
         <w:pStyle w:val="Heading2"/>
       </w:pPr>
       <w:r>
-        <w:t>2.4 SQL query list in plain English</w:t>
+        <w:t>2.4 SQL query list (plain English)</w:t>
       </w:r>
     </w:p>
     <w:p>
@@ -1908,7 +1972,7 @@
         <w:pStyle w:val="ListNumber"/>
       </w:pPr>
       <w:r>
-        <w:t>List cards and quantities for a selected deck.</w:t>
+        <w:t>List all cards in a selected deck with quantities.</w:t>
       </w:r>
     </w:p>
     <w:p>
@@ -1916,7 +1980,7 @@
         <w:pStyle w:val="ListNumber"/>
       </w:pPr>
       <w:r>
-        <w:t>Display players with the largest card collections.</w:t>
+        <w:t>Show players with the largest card collections.</w:t>
       </w:r>
     </w:p>
     <w:p>
@@ -1924,7 +1988,7 @@
         <w:pStyle w:val="ListNumber"/>
       </w:pPr>
       <w:r>
-        <w:t>Calculate players registered in each tournament.</w:t>
+        <w:t>Count players registered for each tournament.</w:t>
       </w:r>
     </w:p>
     <w:p>
@@ -1932,7 +1996,7 @@
         <w:pStyle w:val="ListNumber"/>
       </w:pPr>
       <w:r>
-        <w:t>Insert new player records.</w:t>
+        <w:t>Insert a new player.</w:t>
       </w:r>
     </w:p>
     <w:p>
@@ -1940,7 +2004,7 @@
         <w:pStyle w:val="ListNumber"/>
       </w:pPr>
       <w:r>
-        <w:t>Update selected records.</w:t>
+        <w:t>Update a selected record.</w:t>
       </w:r>
     </w:p>
     <w:p>
@@ -1948,7 +2012,7 @@
         <w:pStyle w:val="ListNumber"/>
       </w:pPr>
       <w:r>
-        <w:t>Delete selected records.</w:t>
+        <w:t>Delete a selected record.</w:t>
       </w:r>
     </w:p>
     <w:p>
@@ -1964,15 +2028,15 @@
         <w:pStyle w:val="Heading2"/>
       </w:pPr>
       <w:r>
-        <w:t>3.1 Structure chart</w:t>
+        <w:t>3.1 Structure chart diagram</w:t>
       </w:r>
     </w:p>
     <w:p>
       <w:r>
         <w:drawing>
           <wp:inline xmlns:a="http://schemas.openxmlformats.org/drawingml/2006/main" xmlns:pic="http://schemas.openxmlformats.org/drawingml/2006/picture">
-            <wp:extent cx="6217920" cy="3674225"/>
-            <wp:docPr id="4" name="Picture 4"/>
+            <wp:extent cx="6309360" cy="3728258"/>
+            <wp:docPr id="6" name="Picture 6"/>
             <wp:cNvGraphicFramePr>
               <a:graphicFrameLocks noChangeAspect="1"/>
             </wp:cNvGraphicFramePr>
@@ -1980,11 +2044,11 @@
               <a:graphicData uri="http://schemas.openxmlformats.org/drawingml/2006/picture">
                 <pic:pic>
                   <pic:nvPicPr>
-                    <pic:cNvPr id="0" name="structure_chart.png"/>
+                    <pic:cNvPr id="0" name="structure.png"/>
                     <pic:cNvPicPr/>
                   </pic:nvPicPr>
                   <pic:blipFill>
-                    <a:blip r:embed="rId12"/>
+                    <a:blip r:embed="rId14"/>
                     <a:stretch>
                       <a:fillRect/>
                     </a:stretch>
@@ -1992,7 +2056,7 @@
                   <pic:spPr>
                     <a:xfrm>
                       <a:off x="0" y="0"/>
-                      <a:ext cx="6217920" cy="3674225"/>
+                      <a:ext cx="6309360" cy="3728258"/>
                     </a:xfrm>
                     <a:prstGeom prst="rect"/>
                   </pic:spPr>
@@ -2082,7 +2146,7 @@
           </w:tcPr>
           <w:p>
             <w:r>
-              <w:t>open sqlite connection and enable foreign keys</w:t>
+              <w:t>Open DB and enable foreign keys</w:t>
             </w:r>
           </w:p>
         </w:tc>
@@ -2124,7 +2188,7 @@
           </w:tcPr>
           <w:p>
             <w:r>
-              <w:t>insert validated player record</w:t>
+              <w:t>Insert validated player</w:t>
             </w:r>
           </w:p>
         </w:tc>
@@ -2134,7 +2198,7 @@
           </w:tcPr>
           <w:p>
             <w:r>
-              <w:t>conn name email</w:t>
+              <w:t>conn, name, email</w:t>
             </w:r>
           </w:p>
         </w:tc>
@@ -2166,7 +2230,7 @@
           </w:tcPr>
           <w:p>
             <w:r>
-              <w:t>find player rows by name or email</w:t>
+              <w:t>Search by name/email</w:t>
             </w:r>
           </w:p>
         </w:tc>
@@ -2176,7 +2240,7 @@
           </w:tcPr>
           <w:p>
             <w:r>
-              <w:t>conn term</w:t>
+              <w:t>conn, term</w:t>
             </w:r>
           </w:p>
         </w:tc>
@@ -2186,7 +2250,7 @@
           </w:tcPr>
           <w:p>
             <w:r>
-              <w:t>row list</w:t>
+              <w:t>rows</w:t>
             </w:r>
           </w:p>
         </w:tc>
@@ -2198,7 +2262,7 @@
           </w:tcPr>
           <w:p>
             <w:r>
-              <w:t>update_player(conn, player_id, ... )</w:t>
+              <w:t>update_player(conn, player_id, ...)</w:t>
             </w:r>
           </w:p>
         </w:tc>
@@ -2208,7 +2272,7 @@
           </w:tcPr>
           <w:p>
             <w:r>
-              <w:t>update existing player details</w:t>
+              <w:t>Update existing player</w:t>
             </w:r>
           </w:p>
         </w:tc>
@@ -2218,7 +2282,7 @@
           </w:tcPr>
           <w:p>
             <w:r>
-              <w:t>conn player_id fields</w:t>
+              <w:t>conn, id, fields</w:t>
             </w:r>
           </w:p>
         </w:tc>
@@ -2250,7 +2314,7 @@
           </w:tcPr>
           <w:p>
             <w:r>
-              <w:t>delete player and dependent data per FK rules</w:t>
+              <w:t>Delete player with FK-safe behavior</w:t>
             </w:r>
           </w:p>
         </w:tc>
@@ -2260,7 +2324,7 @@
           </w:tcPr>
           <w:p>
             <w:r>
-              <w:t>conn player_id</w:t>
+              <w:t>conn, id</w:t>
             </w:r>
           </w:p>
         </w:tc>
@@ -2282,7 +2346,7 @@
           </w:tcPr>
           <w:p>
             <w:r>
-              <w:t>create_card(conn, ... )</w:t>
+              <w:t>create_card(conn, ...)</w:t>
             </w:r>
           </w:p>
         </w:tc>
@@ -2292,7 +2356,7 @@
           </w:tcPr>
           <w:p>
             <w:r>
-              <w:t>insert card linked to set</w:t>
+              <w:t>Insert card linked to set</w:t>
             </w:r>
           </w:p>
         </w:tc>
@@ -2302,7 +2366,7 @@
           </w:tcPr>
           <w:p>
             <w:r>
-              <w:t>conn fields</w:t>
+              <w:t>conn, fields</w:t>
             </w:r>
           </w:p>
         </w:tc>
@@ -2334,7 +2398,7 @@
           </w:tcPr>
           <w:p>
             <w:r>
-              <w:t>create deck for player</w:t>
+              <w:t>Create deck</w:t>
             </w:r>
           </w:p>
         </w:tc>
@@ -2344,7 +2408,7 @@
           </w:tcPr>
           <w:p>
             <w:r>
-              <w:t>conn player_id name</w:t>
+              <w:t>conn, player_id, name</w:t>
             </w:r>
           </w:p>
         </w:tc>
@@ -2376,7 +2440,7 @@
           </w:tcPr>
           <w:p>
             <w:r>
-              <w:t>insert/update deck card quantity</w:t>
+              <w:t>Insert/update deck quantity</w:t>
             </w:r>
           </w:p>
         </w:tc>
@@ -2386,7 +2450,7 @@
           </w:tcPr>
           <w:p>
             <w:r>
-              <w:t>conn ids quantity</w:t>
+              <w:t>conn, ids, qty</w:t>
             </w:r>
           </w:p>
         </w:tc>
@@ -2408,7 +2472,7 @@
           </w:tcPr>
           <w:p>
             <w:r>
-              <w:t>create_tournament(conn, ... )</w:t>
+              <w:t>create_tournament(conn, ...)</w:t>
             </w:r>
           </w:p>
         </w:tc>
@@ -2418,7 +2482,7 @@
           </w:tcPr>
           <w:p>
             <w:r>
-              <w:t>insert tournament</w:t>
+              <w:t>Insert tournament</w:t>
             </w:r>
           </w:p>
         </w:tc>
@@ -2428,7 +2492,7 @@
           </w:tcPr>
           <w:p>
             <w:r>
-              <w:t>conn fields</w:t>
+              <w:t>conn, fields</w:t>
             </w:r>
           </w:p>
         </w:tc>
@@ -2460,7 +2524,7 @@
           </w:tcPr>
           <w:p>
             <w:r>
-              <w:t>insert tournament entry</w:t>
+              <w:t>Insert tournament entry</w:t>
             </w:r>
           </w:p>
         </w:tc>
@@ -2470,7 +2534,7 @@
           </w:tcPr>
           <w:p>
             <w:r>
-              <w:t>conn ids</w:t>
+              <w:t>conn, ids</w:t>
             </w:r>
           </w:p>
         </w:tc>
@@ -2502,7 +2566,7 @@
           </w:tcPr>
           <w:p>
             <w:r>
-              <w:t>join/group/order report rows</w:t>
+              <w:t>Run grouped report query</w:t>
             </w:r>
           </w:p>
         </w:tc>
@@ -2522,7 +2586,7 @@
           </w:tcPr>
           <w:p>
             <w:r>
-              <w:t>row list</w:t>
+              <w:t>rows</w:t>
             </w:r>
           </w:p>
         </w:tc>
@@ -2533,7 +2597,7 @@
         <w:pStyle w:val="Heading2"/>
       </w:pPr>
       <w:r>
-        <w:t>3.3 Interaction between Python and SQLite</w:t>
+        <w:t>3.3 Python and SQLite interaction</w:t>
       </w:r>
     </w:p>
     <w:p>
@@ -2541,7 +2605,7 @@
         <w:pStyle w:val="ListBullet"/>
       </w:pPr>
       <w:r>
-        <w:t>Main menu receives user selections and passes data to module functions.</w:t>
+        <w:t>User selects menu action in UI layer.</w:t>
       </w:r>
     </w:p>
     <w:p>
@@ -2549,7 +2613,7 @@
         <w:pStyle w:val="ListBullet"/>
       </w:pPr>
       <w:r>
-        <w:t>Module functions validate user input before SQL operations.</w:t>
+        <w:t>Module validates input and business rules.</w:t>
       </w:r>
     </w:p>
     <w:p>
@@ -2557,7 +2621,7 @@
         <w:pStyle w:val="ListBullet"/>
       </w:pPr>
       <w:r>
-        <w:t>Database helper executes parameterised SQL and controls commits/rollbacks.</w:t>
+        <w:t>DB helper executes parameterised SQL and handles commit/rollback.</w:t>
       </w:r>
     </w:p>
     <w:p>
@@ -2565,7 +2629,7 @@
         <w:pStyle w:val="ListBullet"/>
       </w:pPr>
       <w:r>
-        <w:t>Report functions run joins, aggregates, grouping and ordering for output.</w:t>
+        <w:t>Results are returned and displayed as admin output.</w:t>
       </w:r>
     </w:p>
     <w:sectPr>

</xml_diff>